<commit_message>
fix: AH offer always shows HD before AB, split Konditionen per service
HD/AB order in the printed offer now follows a fixed order instead of
click order, and Konditionen is split into separate HD and AB tables
(each shown only when that service is booked) instead of one table
that silently dropped the second service's schedule details.

Co-Authored-By: Claude Sonnet 5 <noreply@anthropic.com>
</commit_message>
<xml_diff>
--- a/src/templates/Angebot-AH-alt-4.docx
+++ b/src/templates/Angebot-AH-alt-4.docx
@@ -28,15 +28,15 @@
         <mc:AlternateContent>
           <mc:Choice Requires="wps">
             <w:drawing>
-              <wp:anchor behindDoc="0" distT="0" distB="0" distL="0" distR="0" simplePos="0" locked="0" layoutInCell="0" allowOverlap="1" relativeHeight="7">
+              <wp:anchor behindDoc="0" distT="635" distB="635" distL="635" distR="635" simplePos="0" locked="0" layoutInCell="0" allowOverlap="1" relativeHeight="7">
                 <wp:simplePos x="0" y="0"/>
                 <wp:positionH relativeFrom="page">
                   <wp:posOffset>0</wp:posOffset>
                 </wp:positionH>
                 <wp:positionV relativeFrom="paragraph">
-                  <wp:posOffset>3566160</wp:posOffset>
+                  <wp:posOffset>3565525</wp:posOffset>
                 </wp:positionV>
-                <wp:extent cx="217170" cy="0"/>
+                <wp:extent cx="217170" cy="635"/>
                 <wp:effectExtent l="635" t="635" r="635" b="635"/>
                 <wp:wrapNone/>
                 <wp:docPr id="1" name="Horizontal line 1"/>
@@ -47,7 +47,7 @@
                       <wps:spPr>
                         <a:xfrm>
                           <a:off x="0" y="0"/>
-                          <a:ext cx="217080" cy="0"/>
+                          <a:ext cx="217080" cy="720"/>
                         </a:xfrm>
                         <a:prstGeom prst="line">
                           <a:avLst/>
@@ -73,7 +73,7 @@
           </mc:Choice>
           <mc:Fallback>
             <w:pict>
-              <v:line id="shape_0" from="0pt,280.8pt" to="17.05pt,280.8pt" ID="Horizontal line 1" stroked="t" o:allowincell="f" style="position:absolute;mso-position-horizontal-relative:page">
+              <v:line id="shape_0" from="0pt,280.75pt" to="17.05pt,280.75pt" ID="Horizontal line 1" stroked="t" o:allowincell="f" style="position:absolute;mso-position-horizontal-relative:page">
                 <v:stroke color="black" joinstyle="round" endcap="flat"/>
                 <v:fill o:detectmouseclick="t" on="false"/>
                 <w10:wrap type="none"/>
@@ -533,7 +533,7 @@
         <mc:AlternateContent>
           <mc:Choice Requires="wps">
             <w:drawing>
-              <wp:anchor behindDoc="0" distT="0" distB="0" distL="0" distR="0" simplePos="0" locked="0" layoutInCell="0" allowOverlap="1" relativeHeight="8">
+              <wp:anchor behindDoc="0" distT="635" distB="635" distL="635" distR="635" simplePos="0" locked="0" layoutInCell="0" allowOverlap="1" relativeHeight="8">
                 <wp:simplePos x="0" y="0"/>
                 <wp:positionH relativeFrom="page">
                   <wp:posOffset>0</wp:posOffset>
@@ -629,15 +629,15 @@
         <mc:AlternateContent>
           <mc:Choice Requires="wps">
             <w:drawing>
-              <wp:anchor behindDoc="0" distT="0" distB="0" distL="0" distR="0" simplePos="0" locked="0" layoutInCell="0" allowOverlap="1" relativeHeight="9">
+              <wp:anchor behindDoc="0" distT="635" distB="635" distL="635" distR="635" simplePos="0" locked="0" layoutInCell="0" allowOverlap="1" relativeHeight="9">
                 <wp:simplePos x="0" y="0"/>
                 <wp:positionH relativeFrom="page">
                   <wp:posOffset>7342505</wp:posOffset>
                 </wp:positionH>
                 <wp:positionV relativeFrom="page">
-                  <wp:posOffset>3566160</wp:posOffset>
+                  <wp:posOffset>3565525</wp:posOffset>
                 </wp:positionV>
-                <wp:extent cx="217170" cy="0"/>
+                <wp:extent cx="217170" cy="635"/>
                 <wp:effectExtent l="635" t="635" r="635" b="635"/>
                 <wp:wrapNone/>
                 <wp:docPr id="3" name="Horizontal line 3"/>
@@ -648,7 +648,7 @@
                       <wps:spPr>
                         <a:xfrm>
                           <a:off x="0" y="0"/>
-                          <a:ext cx="217080" cy="0"/>
+                          <a:ext cx="217080" cy="720"/>
                         </a:xfrm>
                         <a:prstGeom prst="line">
                           <a:avLst/>
@@ -674,7 +674,7 @@
           </mc:Choice>
           <mc:Fallback>
             <w:pict>
-              <v:line id="shape_0" from="578.15pt,280.8pt" to="595.2pt,280.8pt" ID="Horizontal line 3" stroked="t" o:allowincell="f" style="position:absolute;mso-position-horizontal-relative:page;mso-position-vertical-relative:page">
+              <v:line id="shape_0" from="578.15pt,280.75pt" to="595.2pt,280.75pt" ID="Horizontal line 3" stroked="t" o:allowincell="f" style="position:absolute;mso-position-horizontal-relative:page;mso-position-vertical-relative:page">
                 <v:stroke color="black" joinstyle="round" endcap="flat"/>
                 <v:fill o:detectmouseclick="t" on="false"/>
                 <w10:wrap type="none"/>
@@ -685,7 +685,7 @@
         <mc:AlternateContent>
           <mc:Choice Requires="wps">
             <w:drawing>
-              <wp:anchor behindDoc="0" distT="0" distB="0" distL="0" distR="0" simplePos="0" locked="0" layoutInCell="0" allowOverlap="1" relativeHeight="10">
+              <wp:anchor behindDoc="0" distT="635" distB="635" distL="635" distR="635" simplePos="0" locked="0" layoutInCell="0" allowOverlap="1" relativeHeight="10">
                 <wp:simplePos x="0" y="0"/>
                 <wp:positionH relativeFrom="page">
                   <wp:posOffset>7342505</wp:posOffset>
@@ -1698,7 +1698,34 @@
                 <w:sz w:val="19"/>
                 <w:szCs w:val="19"/>
               </w:rPr>
-              <w:t>Konditionen:</w:t>
+              <w:t xml:space="preserve">Konditionen – </w:t>
+            </w:r>
+            <w:r>
+              <w:rPr>
+                <w:b/>
+                <w:bCs/>
+                <w:sz w:val="19"/>
+                <w:szCs w:val="19"/>
+              </w:rPr>
+              <w:t>H</w:t>
+            </w:r>
+            <w:r>
+              <w:rPr>
+                <w:b/>
+                <w:bCs/>
+                <w:sz w:val="19"/>
+                <w:szCs w:val="19"/>
+              </w:rPr>
+              <w:t>a</w:t>
+            </w:r>
+            <w:r>
+              <w:rPr>
+                <w:b/>
+                <w:bCs/>
+                <w:sz w:val="19"/>
+                <w:szCs w:val="19"/>
+              </w:rPr>
+              <w:t>ushaltnahe Dienstleistungen</w:t>
             </w:r>
           </w:p>
         </w:tc>
@@ -1747,21 +1774,33 @@
               <w:jc w:val="left"/>
               <w:rPr>
                 <w:rFonts w:ascii="Open Sans" w:hAnsi="Open Sans" w:eastAsia="Open Sans" w:cs="Open Sans"/>
-                <w:color w:val="070707"/>
-                <w:sz w:val="17"/>
-                <w:szCs w:val="17"/>
+                <w:b w:val="false"/>
+                <w:i w:val="false"/>
+                <w:caps w:val="false"/>
+                <w:smallCaps w:val="false"/>
+                <w:color w:val="000000"/>
+                <w:spacing w:val="0"/>
+                <w:kern w:val="0"/>
+                <w:sz w:val="17"/>
+                <w:szCs w:val="17"/>
+                <w:lang w:val="pl-PL" w:eastAsia="en-US" w:bidi="ar-SA"/>
               </w:rPr>
             </w:pPr>
             <w:r>
               <w:rPr>
-                <w:rFonts w:eastAsia="Open Sans" w:cs="Open Sans"/>
-                <w:color w:val="070707"/>
+                <w:rFonts w:eastAsia="Open Sans" w:cs="Open Sans" w:ascii="Open Sans" w:hAnsi="Open Sans"/>
+                <w:b w:val="false"/>
+                <w:i w:val="false"/>
+                <w:caps w:val="false"/>
+                <w:smallCaps w:val="false"/>
+                <w:color w:val="000000"/>
+                <w:spacing w:val="0"/>
                 <w:kern w:val="0"/>
                 <w:sz w:val="17"/>
                 <w:szCs w:val="17"/>
                 <w:lang w:val="pl-PL" w:eastAsia="en-US" w:bidi="ar-SA"/>
               </w:rPr>
-              <w:t>{#AhKondRows}{AhKondLabel}</w:t>
+              <w:t>{#AhHasHnD}{#AhKondRowsHnD}{AhKondLabel}</w:t>
             </w:r>
           </w:p>
         </w:tc>
@@ -1778,21 +1817,33 @@
               <w:jc w:val="left"/>
               <w:rPr>
                 <w:rFonts w:ascii="Open Sans" w:hAnsi="Open Sans" w:eastAsia="Open Sans" w:cs="Open Sans"/>
-                <w:color w:val="070707"/>
-                <w:sz w:val="17"/>
-                <w:szCs w:val="17"/>
+                <w:b w:val="false"/>
+                <w:i w:val="false"/>
+                <w:caps w:val="false"/>
+                <w:smallCaps w:val="false"/>
+                <w:color w:val="000000"/>
+                <w:spacing w:val="0"/>
+                <w:kern w:val="0"/>
+                <w:sz w:val="17"/>
+                <w:szCs w:val="17"/>
+                <w:lang w:val="pl-PL" w:eastAsia="en-US" w:bidi="ar-SA"/>
               </w:rPr>
             </w:pPr>
             <w:r>
               <w:rPr>
-                <w:rFonts w:eastAsia="Open Sans" w:cs="Open Sans"/>
-                <w:color w:val="070707"/>
+                <w:rFonts w:eastAsia="Open Sans" w:cs="Open Sans" w:ascii="Open Sans" w:hAnsi="Open Sans"/>
+                <w:b w:val="false"/>
+                <w:i w:val="false"/>
+                <w:caps w:val="false"/>
+                <w:smallCaps w:val="false"/>
+                <w:color w:val="000000"/>
+                <w:spacing w:val="0"/>
                 <w:kern w:val="0"/>
                 <w:sz w:val="17"/>
                 <w:szCs w:val="17"/>
                 <w:lang w:val="pl-PL" w:eastAsia="en-US" w:bidi="ar-SA"/>
               </w:rPr>
-              <w:t>{AhKondValue}{/AhKondRows}</w:t>
+              <w:t>{AhKondValue}{/AhKondRowsHnD}{/AhHasHnD}</w:t>
             </w:r>
           </w:p>
         </w:tc>
@@ -1801,7 +1852,206 @@
     <w:p>
       <w:pPr>
         <w:pStyle w:val="Normal"/>
-        <w:spacing w:before="0" w:after="160"/>
+        <w:spacing w:before="0" w:after="80"/>
+        <w:rPr>
+          <w:rFonts w:ascii="Open Sans" w:hAnsi="Open Sans" w:eastAsia="Open Sans" w:cs="Open Sans"/>
+          <w:color w:val="070707"/>
+          <w:sz w:val="17"/>
+          <w:szCs w:val="17"/>
+        </w:rPr>
+      </w:pPr>
+      <w:r>
+        <w:rPr>
+          <w:rFonts w:eastAsia="Open Sans" w:cs="Open Sans"/>
+          <w:color w:val="070707"/>
+          <w:sz w:val="17"/>
+          <w:szCs w:val="17"/>
+        </w:rPr>
+        <w:br/>
+      </w:r>
+    </w:p>
+    <w:tbl>
+      <w:tblPr>
+        <w:tblStyle w:val="NormalTable0"/>
+        <w:tblW w:w="9354" w:type="dxa"/>
+        <w:jc w:val="left"/>
+        <w:tblInd w:w="0" w:type="dxa"/>
+        <w:tblLayout w:type="fixed"/>
+        <w:tblCellMar>
+          <w:top w:w="80" w:type="dxa"/>
+          <w:left w:w="80" w:type="dxa"/>
+          <w:bottom w:w="80" w:type="dxa"/>
+          <w:right w:w="80" w:type="dxa"/>
+        </w:tblCellMar>
+        <w:tblLook w:val="04a0" w:noVBand="1" w:noHBand="0" w:lastColumn="0" w:firstColumn="1" w:lastRow="0" w:firstRow="1"/>
+      </w:tblPr>
+      <w:tblGrid>
+        <w:gridCol w:w="6058"/>
+        <w:gridCol w:w="3296"/>
+      </w:tblGrid>
+      <w:tr>
+        <w:trPr/>
+        <w:tc>
+          <w:tcPr>
+            <w:tcW w:w="6058" w:type="dxa"/>
+            <w:tcBorders/>
+            <w:shd w:fill="E8E8E8" w:val="clear"/>
+          </w:tcPr>
+          <w:p>
+            <w:pPr>
+              <w:pStyle w:val="Normal"/>
+              <w:spacing w:lineRule="auto" w:line="240" w:before="0" w:after="0"/>
+              <w:rPr>
+                <w:rFonts w:ascii="Open Sans" w:hAnsi="Open Sans" w:eastAsia="Open Sans" w:cs="Open Sans"/>
+                <w:color w:val="070707"/>
+                <w:sz w:val="17"/>
+                <w:szCs w:val="17"/>
+              </w:rPr>
+            </w:pPr>
+            <w:r>
+              <w:rPr>
+                <w:b/>
+                <w:bCs/>
+                <w:sz w:val="19"/>
+                <w:szCs w:val="19"/>
+              </w:rPr>
+              <w:t xml:space="preserve">Konditionen – </w:t>
+            </w:r>
+            <w:r>
+              <w:rPr>
+                <w:b/>
+                <w:bCs/>
+                <w:sz w:val="19"/>
+                <w:szCs w:val="19"/>
+              </w:rPr>
+              <w:t>Alltagsbegleitung</w:t>
+            </w:r>
+          </w:p>
+        </w:tc>
+        <w:tc>
+          <w:tcPr>
+            <w:tcW w:w="3296" w:type="dxa"/>
+            <w:tcBorders/>
+            <w:shd w:fill="E8E8E8" w:val="clear"/>
+          </w:tcPr>
+          <w:p>
+            <w:pPr>
+              <w:pStyle w:val="Normal"/>
+              <w:suppressAutoHyphens w:val="true"/>
+              <w:spacing w:before="60" w:after="60"/>
+              <w:jc w:val="left"/>
+              <w:rPr>
+                <w:rFonts w:ascii="Open Sans" w:hAnsi="Open Sans" w:eastAsia="Open Sans" w:cs="Open Sans"/>
+                <w:color w:val="070707"/>
+                <w:sz w:val="17"/>
+                <w:szCs w:val="17"/>
+              </w:rPr>
+            </w:pPr>
+            <w:r>
+              <w:rPr>
+                <w:rFonts w:eastAsia="Open Sans" w:cs="Open Sans"/>
+                <w:color w:val="070707"/>
+                <w:sz w:val="17"/>
+                <w:szCs w:val="17"/>
+              </w:rPr>
+            </w:r>
+          </w:p>
+        </w:tc>
+      </w:tr>
+      <w:tr>
+        <w:trPr/>
+        <w:tc>
+          <w:tcPr>
+            <w:tcW w:w="6058" w:type="dxa"/>
+            <w:tcBorders/>
+          </w:tcPr>
+          <w:p>
+            <w:pPr>
+              <w:pStyle w:val="Normal"/>
+              <w:suppressAutoHyphens w:val="true"/>
+              <w:spacing w:before="60" w:after="60"/>
+              <w:jc w:val="left"/>
+              <w:rPr>
+                <w:rFonts w:ascii="Open Sans" w:hAnsi="Open Sans" w:eastAsia="Open Sans" w:cs="Open Sans"/>
+                <w:b w:val="false"/>
+                <w:i w:val="false"/>
+                <w:caps w:val="false"/>
+                <w:smallCaps w:val="false"/>
+                <w:color w:val="000000"/>
+                <w:spacing w:val="0"/>
+                <w:kern w:val="0"/>
+                <w:sz w:val="17"/>
+                <w:szCs w:val="17"/>
+                <w:lang w:val="pl-PL" w:eastAsia="en-US" w:bidi="ar-SA"/>
+              </w:rPr>
+            </w:pPr>
+            <w:r>
+              <w:rPr>
+                <w:rFonts w:eastAsia="Open Sans" w:cs="Open Sans" w:ascii="Open Sans" w:hAnsi="Open Sans"/>
+                <w:b w:val="false"/>
+                <w:i w:val="false"/>
+                <w:caps w:val="false"/>
+                <w:smallCaps w:val="false"/>
+                <w:color w:val="000000"/>
+                <w:spacing w:val="0"/>
+                <w:kern w:val="0"/>
+                <w:sz w:val="17"/>
+                <w:szCs w:val="17"/>
+                <w:lang w:val="pl-PL" w:eastAsia="en-US" w:bidi="ar-SA"/>
+              </w:rPr>
+              <w:t>{#AhHasAb}{#AhKondRowsAB}{AhKondLabel}</w:t>
+            </w:r>
+          </w:p>
+        </w:tc>
+        <w:tc>
+          <w:tcPr>
+            <w:tcW w:w="3296" w:type="dxa"/>
+            <w:tcBorders/>
+          </w:tcPr>
+          <w:p>
+            <w:pPr>
+              <w:pStyle w:val="Normal"/>
+              <w:suppressAutoHyphens w:val="true"/>
+              <w:spacing w:before="60" w:after="60"/>
+              <w:jc w:val="left"/>
+              <w:rPr>
+                <w:rFonts w:ascii="Open Sans" w:hAnsi="Open Sans" w:eastAsia="Open Sans" w:cs="Open Sans"/>
+                <w:b w:val="false"/>
+                <w:i w:val="false"/>
+                <w:caps w:val="false"/>
+                <w:smallCaps w:val="false"/>
+                <w:color w:val="000000"/>
+                <w:spacing w:val="0"/>
+                <w:kern w:val="0"/>
+                <w:sz w:val="17"/>
+                <w:szCs w:val="17"/>
+                <w:lang w:val="pl-PL" w:eastAsia="en-US" w:bidi="ar-SA"/>
+              </w:rPr>
+            </w:pPr>
+            <w:r>
+              <w:rPr>
+                <w:rFonts w:eastAsia="Open Sans" w:cs="Open Sans" w:ascii="Open Sans" w:hAnsi="Open Sans"/>
+                <w:b w:val="false"/>
+                <w:i w:val="false"/>
+                <w:caps w:val="false"/>
+                <w:smallCaps w:val="false"/>
+                <w:color w:val="000000"/>
+                <w:spacing w:val="0"/>
+                <w:kern w:val="0"/>
+                <w:sz w:val="17"/>
+                <w:szCs w:val="17"/>
+                <w:lang w:val="pl-PL" w:eastAsia="en-US" w:bidi="ar-SA"/>
+              </w:rPr>
+              <w:t>{AhKondValue}{/AhKondRowsAB}{/AhHasAb}</w:t>
+            </w:r>
+          </w:p>
+        </w:tc>
+      </w:tr>
+    </w:tbl>
+    <w:p>
+      <w:pPr>
+        <w:pStyle w:val="Normal"/>
+        <w:spacing w:before="0" w:after="240"/>
         <w:rPr>
           <w:rFonts w:ascii="Open Sans" w:hAnsi="Open Sans" w:eastAsia="Open Sans" w:cs="Open Sans"/>
           <w:color w:val="070707"/>
@@ -1823,22 +2073,16 @@
         <w:pStyle w:val="Normal"/>
         <w:spacing w:before="0" w:after="80"/>
         <w:rPr>
-          <w:rFonts w:ascii="Open Sans" w:hAnsi="Open Sans" w:eastAsia="Open Sans" w:cs="Open Sans"/>
-          <w:color w:val="070707"/>
           <w:sz w:val="17"/>
           <w:szCs w:val="17"/>
         </w:rPr>
       </w:pPr>
       <w:r>
         <w:rPr>
-          <w:rFonts w:eastAsia="Open Sans" w:cs="Open Sans"/>
-          <w:color w:val="070707"/>
           <w:sz w:val="17"/>
           <w:szCs w:val="17"/>
         </w:rPr>
         <w:t>Bitte unterschreiben Sie bei Annahme dieses Angebots und schicken Sie es uns zurück – gerne auch per E-Mail an service@e-m-c-2.de. Die Unterschrift gilt für uns als Auftragsbestätigung.</w:t>
-        <w:br/>
-        <w:br/>
       </w:r>
     </w:p>
     <w:p>
@@ -2176,8 +2420,8 @@
     </w:tblPr>
     <w:tblGrid>
       <w:gridCol w:w="3181"/>
-      <w:gridCol w:w="3184"/>
-      <w:gridCol w:w="3179"/>
+      <w:gridCol w:w="3183"/>
+      <w:gridCol w:w="3180"/>
     </w:tblGrid>
     <w:tr>
       <w:trPr>
@@ -2259,7 +2503,7 @@
       </w:tc>
       <w:tc>
         <w:tcPr>
-          <w:tcW w:w="3184" w:type="dxa"/>
+          <w:tcW w:w="3183" w:type="dxa"/>
           <w:tcBorders>
             <w:top w:val="single" w:sz="18" w:space="0" w:color="2E74B5"/>
           </w:tcBorders>
@@ -2332,7 +2576,7 @@
       </w:tc>
       <w:tc>
         <w:tcPr>
-          <w:tcW w:w="3179" w:type="dxa"/>
+          <w:tcW w:w="3180" w:type="dxa"/>
           <w:tcBorders>
             <w:top w:val="single" w:sz="18" w:space="0" w:color="2E74B5"/>
           </w:tcBorders>
@@ -2548,8 +2792,8 @@
     </w:tblPr>
     <w:tblGrid>
       <w:gridCol w:w="3181"/>
-      <w:gridCol w:w="3184"/>
-      <w:gridCol w:w="3179"/>
+      <w:gridCol w:w="3183"/>
+      <w:gridCol w:w="3180"/>
     </w:tblGrid>
     <w:tr>
       <w:trPr>
@@ -2631,7 +2875,7 @@
       </w:tc>
       <w:tc>
         <w:tcPr>
-          <w:tcW w:w="3184" w:type="dxa"/>
+          <w:tcW w:w="3183" w:type="dxa"/>
           <w:tcBorders>
             <w:top w:val="single" w:sz="18" w:space="0" w:color="2E74B5"/>
           </w:tcBorders>
@@ -2704,7 +2948,7 @@
       </w:tc>
       <w:tc>
         <w:tcPr>
-          <w:tcW w:w="3179" w:type="dxa"/>
+          <w:tcW w:w="3180" w:type="dxa"/>
           <w:tcBorders>
             <w:top w:val="single" w:sz="18" w:space="0" w:color="2E74B5"/>
           </w:tcBorders>
@@ -2926,7 +3170,7 @@
     <w:r>
       <w:rPr/>
       <w:drawing>
-        <wp:anchor behindDoc="1" distT="0" distB="0" distL="0" distR="0" simplePos="0" locked="0" layoutInCell="0" allowOverlap="1" relativeHeight="2">
+        <wp:anchor behindDoc="1" distT="0" distB="0" distL="0" distR="0" simplePos="0" locked="0" layoutInCell="0" allowOverlap="1" relativeHeight="5">
           <wp:simplePos x="0" y="0"/>
           <wp:positionH relativeFrom="margin">
             <wp:align>right</wp:align>
@@ -3068,7 +3312,7 @@
     <w:r>
       <w:rPr/>
       <w:drawing>
-        <wp:anchor behindDoc="1" distT="0" distB="0" distL="0" distR="0" simplePos="0" locked="0" layoutInCell="0" allowOverlap="1" relativeHeight="2">
+        <wp:anchor behindDoc="1" distT="0" distB="0" distL="0" distR="0" simplePos="0" locked="0" layoutInCell="0" allowOverlap="1" relativeHeight="5">
           <wp:simplePos x="0" y="0"/>
           <wp:positionH relativeFrom="margin">
             <wp:align>right</wp:align>
@@ -3828,8 +4072,8 @@
       <w:sz w:val="21"/>
     </w:rPr>
   </w:style>
-  <w:style w:type="character" w:styleId="Bullets">
-    <w:name w:val="Bullets"/>
+  <w:style w:type="character" w:styleId="Bulletsuser">
+    <w:name w:val="Bullets (user)"/>
     <w:qFormat/>
     <w:rPr>
       <w:rFonts w:ascii="OpenSymbol" w:hAnsi="OpenSymbol" w:eastAsia="OpenSymbol" w:cs="OpenSymbol"/>

</xml_diff>

<commit_message>
fix: Konditionen header row wasn't actually conditional
The AhHasHnD/AhHasAb tags were placed inside the data row only, so
docxtemplater conditioned just the data row and left the "Konditionen –
..." header row always visible. Moved the condition to standalone
paragraphs wrapping the entire table (header + data rows), which is
docxtemplater's supported pattern for conditionally hiding a whole
table. Verified by rendering HD-only, AB-only, and both-selected
payloads.

Co-Authored-By: Claude Sonnet 5 <noreply@anthropic.com>
</commit_message>
<xml_diff>
--- a/src/templates/Angebot-AH-alt-4.docx
+++ b/src/templates/Angebot-AH-alt-4.docx
@@ -28,18 +28,18 @@
         <mc:AlternateContent>
           <mc:Choice Requires="wps">
             <w:drawing>
-              <wp:anchor behindDoc="0" distT="635" distB="635" distL="635" distR="635" simplePos="0" locked="0" layoutInCell="0" allowOverlap="1" relativeHeight="7">
+              <wp:anchor behindDoc="0" distT="635" distB="635" distL="635" distR="635" simplePos="0" locked="0" layoutInCell="0" allowOverlap="1" relativeHeight="9">
                 <wp:simplePos x="0" y="0"/>
                 <wp:positionH relativeFrom="page">
-                  <wp:posOffset>0</wp:posOffset>
+                  <wp:posOffset>7342505</wp:posOffset>
                 </wp:positionH>
-                <wp:positionV relativeFrom="paragraph">
-                  <wp:posOffset>3565525</wp:posOffset>
+                <wp:positionV relativeFrom="page">
+                  <wp:posOffset>3566160</wp:posOffset>
                 </wp:positionV>
                 <wp:extent cx="217170" cy="635"/>
                 <wp:effectExtent l="635" t="635" r="635" b="635"/>
                 <wp:wrapNone/>
-                <wp:docPr id="1" name="Horizontal line 1"/>
+                <wp:docPr id="1" name="Horizontal line 3"/>
                 <a:graphic xmlns:a="http://schemas.openxmlformats.org/drawingml/2006/main">
                   <a:graphicData uri="http://schemas.microsoft.com/office/word/2010/wordprocessingShape">
                     <wps:wsp>
@@ -73,7 +73,63 @@
           </mc:Choice>
           <mc:Fallback>
             <w:pict>
-              <v:line id="shape_0" from="0pt,280.75pt" to="17.05pt,280.75pt" ID="Horizontal line 1" stroked="t" o:allowincell="f" style="position:absolute;mso-position-horizontal-relative:page">
+              <v:line id="shape_0" from="578.15pt,280.8pt" to="595.2pt,280.8pt" ID="Horizontal line 3" stroked="t" o:allowincell="f" style="position:absolute;mso-position-horizontal-relative:page;mso-position-vertical-relative:page">
+                <v:stroke color="black" joinstyle="round" endcap="flat"/>
+                <v:fill o:detectmouseclick="t" on="false"/>
+                <w10:wrap type="none"/>
+              </v:line>
+            </w:pict>
+          </mc:Fallback>
+        </mc:AlternateContent>
+        <mc:AlternateContent>
+          <mc:Choice Requires="wps">
+            <w:drawing>
+              <wp:anchor behindDoc="0" distT="635" distB="635" distL="635" distR="635" simplePos="0" locked="0" layoutInCell="0" allowOverlap="1" relativeHeight="7">
+                <wp:simplePos x="0" y="0"/>
+                <wp:positionH relativeFrom="page">
+                  <wp:posOffset>0</wp:posOffset>
+                </wp:positionH>
+                <wp:positionV relativeFrom="page">
+                  <wp:posOffset>3566160</wp:posOffset>
+                </wp:positionV>
+                <wp:extent cx="217170" cy="635"/>
+                <wp:effectExtent l="635" t="635" r="635" b="635"/>
+                <wp:wrapNone/>
+                <wp:docPr id="2" name="Horizontal line 1"/>
+                <a:graphic xmlns:a="http://schemas.openxmlformats.org/drawingml/2006/main">
+                  <a:graphicData uri="http://schemas.microsoft.com/office/word/2010/wordprocessingShape">
+                    <wps:wsp>
+                      <wps:cNvSpPr/>
+                      <wps:spPr>
+                        <a:xfrm>
+                          <a:off x="0" y="0"/>
+                          <a:ext cx="217080" cy="720"/>
+                        </a:xfrm>
+                        <a:prstGeom prst="line">
+                          <a:avLst/>
+                        </a:prstGeom>
+                        <a:ln w="0">
+                          <a:solidFill>
+                            <a:srgbClr val="000000"/>
+                          </a:solidFill>
+                        </a:ln>
+                      </wps:spPr>
+                      <wps:style>
+                        <a:lnRef idx="0"/>
+                        <a:fillRef idx="0"/>
+                        <a:effectRef idx="0"/>
+                        <a:fontRef idx="minor"/>
+                      </wps:style>
+                      <wps:bodyPr/>
+                    </wps:wsp>
+                  </a:graphicData>
+                </a:graphic>
+              </wp:anchor>
+            </w:drawing>
+          </mc:Choice>
+          <mc:Fallback>
+            <w:pict>
+              <v:line id="shape_0" from="0pt,280.8pt" to="17.05pt,280.8pt" ID="Horizontal line 1" stroked="t" o:allowincell="f" style="position:absolute;mso-position-horizontal-relative:page;mso-position-vertical-relative:page">
                 <v:stroke color="black" joinstyle="round" endcap="flat"/>
                 <v:fill o:detectmouseclick="t" on="false"/>
                 <w10:wrap type="none"/>
@@ -544,7 +600,7 @@
                 <wp:extent cx="217170" cy="0"/>
                 <wp:effectExtent l="635" t="635" r="635" b="635"/>
                 <wp:wrapNone/>
-                <wp:docPr id="2" name="Horizontal line 2"/>
+                <wp:docPr id="3" name="Horizontal line 2"/>
                 <a:graphic xmlns:a="http://schemas.openxmlformats.org/drawingml/2006/main">
                   <a:graphicData uri="http://schemas.microsoft.com/office/word/2010/wordprocessingShape">
                     <wps:wsp>
@@ -626,62 +682,6 @@
           <w:sz w:val="17"/>
           <w:szCs w:val="17"/>
         </w:rPr>
-        <mc:AlternateContent>
-          <mc:Choice Requires="wps">
-            <w:drawing>
-              <wp:anchor behindDoc="0" distT="635" distB="635" distL="635" distR="635" simplePos="0" locked="0" layoutInCell="0" allowOverlap="1" relativeHeight="9">
-                <wp:simplePos x="0" y="0"/>
-                <wp:positionH relativeFrom="page">
-                  <wp:posOffset>7342505</wp:posOffset>
-                </wp:positionH>
-                <wp:positionV relativeFrom="page">
-                  <wp:posOffset>3565525</wp:posOffset>
-                </wp:positionV>
-                <wp:extent cx="217170" cy="635"/>
-                <wp:effectExtent l="635" t="635" r="635" b="635"/>
-                <wp:wrapNone/>
-                <wp:docPr id="3" name="Horizontal line 3"/>
-                <a:graphic xmlns:a="http://schemas.openxmlformats.org/drawingml/2006/main">
-                  <a:graphicData uri="http://schemas.microsoft.com/office/word/2010/wordprocessingShape">
-                    <wps:wsp>
-                      <wps:cNvSpPr/>
-                      <wps:spPr>
-                        <a:xfrm>
-                          <a:off x="0" y="0"/>
-                          <a:ext cx="217080" cy="720"/>
-                        </a:xfrm>
-                        <a:prstGeom prst="line">
-                          <a:avLst/>
-                        </a:prstGeom>
-                        <a:ln w="0">
-                          <a:solidFill>
-                            <a:srgbClr val="000000"/>
-                          </a:solidFill>
-                        </a:ln>
-                      </wps:spPr>
-                      <wps:style>
-                        <a:lnRef idx="0"/>
-                        <a:fillRef idx="0"/>
-                        <a:effectRef idx="0"/>
-                        <a:fontRef idx="minor"/>
-                      </wps:style>
-                      <wps:bodyPr/>
-                    </wps:wsp>
-                  </a:graphicData>
-                </a:graphic>
-              </wp:anchor>
-            </w:drawing>
-          </mc:Choice>
-          <mc:Fallback>
-            <w:pict>
-              <v:line id="shape_0" from="578.15pt,280.75pt" to="595.2pt,280.75pt" ID="Horizontal line 3" stroked="t" o:allowincell="f" style="position:absolute;mso-position-horizontal-relative:page;mso-position-vertical-relative:page">
-                <v:stroke color="black" joinstyle="round" endcap="flat"/>
-                <v:fill o:detectmouseclick="t" on="false"/>
-                <w10:wrap type="none"/>
-              </v:line>
-            </w:pict>
-          </mc:Fallback>
-        </mc:AlternateContent>
         <mc:AlternateContent>
           <mc:Choice Requires="wps">
             <w:drawing>
@@ -1653,6 +1653,14 @@
         </w:rPr>
       </w:r>
     </w:p>
+    <w:p>
+      <w:pPr>
+        <w:pStyle w:val="Normal"/>
+      </w:pPr>
+      <w:r>
+        <w:t>{#AhHasHnD}</w:t>
+      </w:r>
+    </w:p>
     <w:tbl>
       <w:tblPr>
         <w:tblStyle w:val="NormalTable0"/>
@@ -1800,7 +1808,7 @@
                 <w:szCs w:val="17"/>
                 <w:lang w:val="pl-PL" w:eastAsia="en-US" w:bidi="ar-SA"/>
               </w:rPr>
-              <w:t>{#AhHasHnD}{#AhKondRowsHnD}{AhKondLabel}</w:t>
+              <w:t>{#AhKondRowsHnD}{AhKondLabel}</w:t>
             </w:r>
           </w:p>
         </w:tc>
@@ -1843,7 +1851,7 @@
                 <w:szCs w:val="17"/>
                 <w:lang w:val="pl-PL" w:eastAsia="en-US" w:bidi="ar-SA"/>
               </w:rPr>
-              <w:t>{AhKondValue}{/AhKondRowsHnD}{/AhHasHnD}</w:t>
+              <w:t>{AhKondValue}{/AhKondRowsHnD}</w:t>
             </w:r>
           </w:p>
         </w:tc>
@@ -1852,15 +1860,23 @@
     <w:p>
       <w:pPr>
         <w:pStyle w:val="Normal"/>
-        <w:spacing w:before="0" w:after="80"/>
-        <w:rPr>
-          <w:rFonts w:ascii="Open Sans" w:hAnsi="Open Sans" w:eastAsia="Open Sans" w:cs="Open Sans"/>
-          <w:color w:val="070707"/>
-          <w:sz w:val="17"/>
-          <w:szCs w:val="17"/>
-        </w:rPr>
       </w:pPr>
       <w:r>
+        <w:t>{/AhHasHnD}</w:t>
+      </w:r>
+    </w:p>
+    <w:p>
+      <w:pPr>
+        <w:pStyle w:val="Normal"/>
+        <w:spacing w:before="0" w:after="80"/>
+        <w:rPr>
+          <w:rFonts w:ascii="Open Sans" w:hAnsi="Open Sans" w:eastAsia="Open Sans" w:cs="Open Sans"/>
+          <w:color w:val="070707"/>
+          <w:sz w:val="17"/>
+          <w:szCs w:val="17"/>
+        </w:rPr>
+      </w:pPr>
+      <w:r>
         <w:rPr>
           <w:rFonts w:eastAsia="Open Sans" w:cs="Open Sans"/>
           <w:color w:val="070707"/>
@@ -1868,6 +1884,14 @@
           <w:szCs w:val="17"/>
         </w:rPr>
         <w:br/>
+      </w:r>
+    </w:p>
+    <w:p>
+      <w:pPr>
+        <w:pStyle w:val="Normal"/>
+      </w:pPr>
+      <w:r>
+        <w:t>{#AhHasAb}</w:t>
       </w:r>
     </w:p>
     <w:tbl>
@@ -1999,7 +2023,7 @@
                 <w:szCs w:val="17"/>
                 <w:lang w:val="pl-PL" w:eastAsia="en-US" w:bidi="ar-SA"/>
               </w:rPr>
-              <w:t>{#AhHasAb}{#AhKondRowsAB}{AhKondLabel}</w:t>
+              <w:t>{#AhKondRowsAB}{AhKondLabel}</w:t>
             </w:r>
           </w:p>
         </w:tc>
@@ -2042,12 +2066,20 @@
                 <w:szCs w:val="17"/>
                 <w:lang w:val="pl-PL" w:eastAsia="en-US" w:bidi="ar-SA"/>
               </w:rPr>
-              <w:t>{AhKondValue}{/AhKondRowsAB}{/AhHasAb}</w:t>
+              <w:t>{AhKondValue}{/AhKondRowsAB}</w:t>
             </w:r>
           </w:p>
         </w:tc>
       </w:tr>
     </w:tbl>
+    <w:p>
+      <w:pPr>
+        <w:pStyle w:val="Normal"/>
+      </w:pPr>
+      <w:r>
+        <w:t>{/AhHasAb}</w:t>
+      </w:r>
+    </w:p>
     <w:p>
       <w:pPr>
         <w:pStyle w:val="Normal"/>
@@ -3170,7 +3202,7 @@
     <w:r>
       <w:rPr/>
       <w:drawing>
-        <wp:anchor behindDoc="1" distT="0" distB="0" distL="0" distR="0" simplePos="0" locked="0" layoutInCell="0" allowOverlap="1" relativeHeight="5">
+        <wp:anchor behindDoc="1" distT="0" distB="0" distL="0" distR="0" simplePos="0" locked="0" layoutInCell="0" allowOverlap="1" relativeHeight="3">
           <wp:simplePos x="0" y="0"/>
           <wp:positionH relativeFrom="margin">
             <wp:align>right</wp:align>
@@ -3312,7 +3344,7 @@
     <w:r>
       <w:rPr/>
       <w:drawing>
-        <wp:anchor behindDoc="1" distT="0" distB="0" distL="0" distR="0" simplePos="0" locked="0" layoutInCell="0" allowOverlap="1" relativeHeight="5">
+        <wp:anchor behindDoc="1" distT="0" distB="0" distL="0" distR="0" simplePos="0" locked="0" layoutInCell="0" allowOverlap="1" relativeHeight="3">
           <wp:simplePos x="0" y="0"/>
           <wp:positionH relativeFrom="margin">
             <wp:align>right</wp:align>

</xml_diff>